<commit_message>
nfsi form template adjustment
</commit_message>
<xml_diff>
--- a/templates/nfsi-form.docx
+++ b/templates/nfsi-form.docx
@@ -14,6 +14,194 @@
           <w:szCs w:val="18"/>
         </w:rPr>
       </w:pPr>
+      <w:bookmarkStart w:id="0" w:name="_GoBack"/>
+      <w:bookmarkEnd w:id="0"/>
+      <w:r>
+        <w:rPr>
+          <w:rFonts w:ascii="Arial" w:hAnsi="Arial" w:eastAsia="Arial" w:cs="Arial"/>
+          <w:b/>
+        </w:rPr>
+        <mc:AlternateContent>
+          <mc:Choice Requires="wps">
+            <w:drawing>
+              <wp:anchor distT="45720" distB="45720" distL="114300" distR="114300" simplePos="0" relativeHeight="251666432" behindDoc="1" locked="0" layoutInCell="1" allowOverlap="1">
+                <wp:simplePos x="0" y="0"/>
+                <wp:positionH relativeFrom="margin">
+                  <wp:posOffset>4814570</wp:posOffset>
+                </wp:positionH>
+                <wp:positionV relativeFrom="paragraph">
+                  <wp:posOffset>-835660</wp:posOffset>
+                </wp:positionV>
+                <wp:extent cx="2202815" cy="262255"/>
+                <wp:effectExtent l="0" t="0" r="0" b="0"/>
+                <wp:wrapNone/>
+                <wp:docPr id="14" name="Text Box 2"/>
+                <wp:cNvGraphicFramePr/>
+                <a:graphic xmlns:a="http://schemas.openxmlformats.org/drawingml/2006/main">
+                  <a:graphicData uri="http://schemas.microsoft.com/office/word/2010/wordprocessingShape">
+                    <wps:wsp>
+                      <wps:cNvSpPr txBox="1">
+                        <a:spLocks noChangeArrowheads="1"/>
+                      </wps:cNvSpPr>
+                      <wps:spPr bwMode="auto">
+                        <a:xfrm>
+                          <a:off x="0" y="0"/>
+                          <a:ext cx="2202815" cy="262255"/>
+                        </a:xfrm>
+                        <a:prstGeom prst="rect">
+                          <a:avLst/>
+                        </a:prstGeom>
+                        <a:noFill/>
+                        <a:ln w="9525">
+                          <a:noFill/>
+                          <a:miter lim="800000"/>
+                        </a:ln>
+                      </wps:spPr>
+                      <wps:txbx>
+                        <w:txbxContent>
+                          <w:p>
+                            <w:pPr>
+                              <w:jc w:val="center"/>
+                              <w:rPr>
+                                <w:rFonts w:hint="default" w:ascii="Arial" w:hAnsi="Arial" w:cs="Arial"/>
+                                <w:b/>
+                                <w:bCs/>
+                                <w:sz w:val="14"/>
+                                <w:szCs w:val="14"/>
+                                <w:u w:val="none"/>
+                                <w:lang w:val="en-PH"/>
+                              </w:rPr>
+                            </w:pPr>
+                            <w:r>
+                              <w:rPr>
+                                <w:rFonts w:hint="default" w:ascii="Arial" w:hAnsi="Arial" w:cs="Arial"/>
+                                <w:b/>
+                                <w:bCs/>
+                                <w:sz w:val="14"/>
+                                <w:szCs w:val="14"/>
+                                <w:u w:val="none"/>
+                                <w:lang w:val="en-PH"/>
+                              </w:rPr>
+                              <w:t>{</w:t>
+                            </w:r>
+                            <w:r>
+                              <w:rPr>
+                                <w:rFonts w:hint="default" w:ascii="Arial" w:hAnsi="Arial" w:cs="Arial"/>
+                                <w:b/>
+                                <w:bCs/>
+                                <w:sz w:val="14"/>
+                                <w:szCs w:val="14"/>
+                                <w:u w:val="none"/>
+                                <w:lang w:val="en-US"/>
+                              </w:rPr>
+                              <w:t>FSIC_APP_NO</w:t>
+                            </w:r>
+                            <w:r>
+                              <w:rPr>
+                                <w:rFonts w:hint="default" w:ascii="Arial" w:hAnsi="Arial" w:cs="Arial"/>
+                                <w:b/>
+                                <w:bCs/>
+                                <w:sz w:val="14"/>
+                                <w:szCs w:val="14"/>
+                                <w:u w:val="none"/>
+                                <w:lang w:val="en-PH"/>
+                              </w:rPr>
+                              <w:t>}</w:t>
+                            </w:r>
+                          </w:p>
+                          <w:p>
+                            <w:pPr>
+                              <w:rPr>
+                                <w:rFonts w:hint="default"/>
+                                <w:lang w:val="en-PH"/>
+                              </w:rPr>
+                            </w:pPr>
+                          </w:p>
+                        </w:txbxContent>
+                      </wps:txbx>
+                      <wps:bodyPr rot="0" vert="horz" wrap="square" lIns="91440" tIns="45720" rIns="91440" bIns="45720" anchor="t" anchorCtr="0">
+                        <a:noAutofit/>
+                      </wps:bodyPr>
+                    </wps:wsp>
+                  </a:graphicData>
+                </a:graphic>
+              </wp:anchor>
+            </w:drawing>
+          </mc:Choice>
+          <mc:Fallback>
+            <w:pict>
+              <v:shape id="Text Box 2" o:spid="_x0000_s1026" o:spt="202" type="#_x0000_t202" style="position:absolute;left:0pt;margin-left:379.1pt;margin-top:-65.8pt;height:20.65pt;width:173.45pt;mso-position-horizontal-relative:margin;z-index:-251650048;mso-width-relative:page;mso-height-relative:page;" filled="f" stroked="f" coordsize="21600,21600" o:gfxdata="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">
+                <v:fill on="f" focussize="0,0"/>
+                <v:stroke on="f" miterlimit="8" joinstyle="miter"/>
+                <v:imagedata o:title=""/>
+                <o:lock v:ext="edit" aspectratio="f"/>
+                <v:textbox>
+                  <w:txbxContent>
+                    <w:p>
+                      <w:pPr>
+                        <w:jc w:val="center"/>
+                        <w:rPr>
+                          <w:rFonts w:hint="default" w:ascii="Arial" w:hAnsi="Arial" w:cs="Arial"/>
+                          <w:b/>
+                          <w:bCs/>
+                          <w:sz w:val="14"/>
+                          <w:szCs w:val="14"/>
+                          <w:u w:val="none"/>
+                          <w:lang w:val="en-PH"/>
+                        </w:rPr>
+                      </w:pPr>
+                      <w:r>
+                        <w:rPr>
+                          <w:rFonts w:hint="default" w:ascii="Arial" w:hAnsi="Arial" w:cs="Arial"/>
+                          <w:b/>
+                          <w:bCs/>
+                          <w:sz w:val="14"/>
+                          <w:szCs w:val="14"/>
+                          <w:u w:val="none"/>
+                          <w:lang w:val="en-PH"/>
+                        </w:rPr>
+                        <w:t>{</w:t>
+                      </w:r>
+                      <w:r>
+                        <w:rPr>
+                          <w:rFonts w:hint="default" w:ascii="Arial" w:hAnsi="Arial" w:cs="Arial"/>
+                          <w:b/>
+                          <w:bCs/>
+                          <w:sz w:val="14"/>
+                          <w:szCs w:val="14"/>
+                          <w:u w:val="none"/>
+                          <w:lang w:val="en-US"/>
+                        </w:rPr>
+                        <w:t>FSIC_APP_NO</w:t>
+                      </w:r>
+                      <w:r>
+                        <w:rPr>
+                          <w:rFonts w:hint="default" w:ascii="Arial" w:hAnsi="Arial" w:cs="Arial"/>
+                          <w:b/>
+                          <w:bCs/>
+                          <w:sz w:val="14"/>
+                          <w:szCs w:val="14"/>
+                          <w:u w:val="none"/>
+                          <w:lang w:val="en-PH"/>
+                        </w:rPr>
+                        <w:t>}</w:t>
+                      </w:r>
+                    </w:p>
+                    <w:p>
+                      <w:pPr>
+                        <w:rPr>
+                          <w:rFonts w:hint="default"/>
+                          <w:lang w:val="en-PH"/>
+                        </w:rPr>
+                      </w:pPr>
+                    </w:p>
+                  </w:txbxContent>
+                </v:textbox>
+              </v:shape>
+            </w:pict>
+          </mc:Fallback>
+        </mc:AlternateContent>
+      </w:r>
     </w:p>
     <w:p>
       <w:pPr>
@@ -2444,8 +2632,6 @@
         </w:rPr>
         <w:t xml:space="preserve">Very truly yours, </w:t>
       </w:r>
-      <w:bookmarkStart w:id="0" w:name="_GoBack"/>
-      <w:bookmarkEnd w:id="0"/>
     </w:p>
     <w:p>
       <w:pPr>
@@ -2615,192 +2801,6 @@
           <w:szCs w:val="32"/>
         </w:rPr>
       </w:pPr>
-      <w:r>
-        <w:rPr>
-          <w:rFonts w:ascii="Arial" w:hAnsi="Arial" w:eastAsia="Arial" w:cs="Arial"/>
-          <w:b/>
-        </w:rPr>
-        <mc:AlternateContent>
-          <mc:Choice Requires="wps">
-            <w:drawing>
-              <wp:anchor distT="45720" distB="45720" distL="114300" distR="114300" simplePos="0" relativeHeight="251666432" behindDoc="1" locked="0" layoutInCell="1" allowOverlap="1">
-                <wp:simplePos x="0" y="0"/>
-                <wp:positionH relativeFrom="margin">
-                  <wp:posOffset>4450715</wp:posOffset>
-                </wp:positionH>
-                <wp:positionV relativeFrom="paragraph">
-                  <wp:posOffset>871220</wp:posOffset>
-                </wp:positionV>
-                <wp:extent cx="2202815" cy="262255"/>
-                <wp:effectExtent l="0" t="0" r="0" b="0"/>
-                <wp:wrapNone/>
-                <wp:docPr id="14" name="Text Box 2"/>
-                <wp:cNvGraphicFramePr/>
-                <a:graphic xmlns:a="http://schemas.openxmlformats.org/drawingml/2006/main">
-                  <a:graphicData uri="http://schemas.microsoft.com/office/word/2010/wordprocessingShape">
-                    <wps:wsp>
-                      <wps:cNvSpPr txBox="1">
-                        <a:spLocks noChangeArrowheads="1"/>
-                      </wps:cNvSpPr>
-                      <wps:spPr bwMode="auto">
-                        <a:xfrm>
-                          <a:off x="0" y="0"/>
-                          <a:ext cx="2202815" cy="262255"/>
-                        </a:xfrm>
-                        <a:prstGeom prst="rect">
-                          <a:avLst/>
-                        </a:prstGeom>
-                        <a:noFill/>
-                        <a:ln w="9525">
-                          <a:noFill/>
-                          <a:miter lim="800000"/>
-                        </a:ln>
-                      </wps:spPr>
-                      <wps:txbx>
-                        <w:txbxContent>
-                          <w:p>
-                            <w:pPr>
-                              <w:jc w:val="center"/>
-                              <w:rPr>
-                                <w:rFonts w:hint="default" w:ascii="Arial" w:hAnsi="Arial" w:cs="Arial"/>
-                                <w:b/>
-                                <w:bCs/>
-                                <w:sz w:val="14"/>
-                                <w:szCs w:val="14"/>
-                                <w:u w:val="none"/>
-                                <w:lang w:val="en-PH"/>
-                              </w:rPr>
-                            </w:pPr>
-                            <w:r>
-                              <w:rPr>
-                                <w:rFonts w:hint="default" w:ascii="Arial" w:hAnsi="Arial" w:cs="Arial"/>
-                                <w:b/>
-                                <w:bCs/>
-                                <w:sz w:val="14"/>
-                                <w:szCs w:val="14"/>
-                                <w:u w:val="none"/>
-                                <w:lang w:val="en-PH"/>
-                              </w:rPr>
-                              <w:t>{</w:t>
-                            </w:r>
-                            <w:r>
-                              <w:rPr>
-                                <w:rFonts w:hint="default" w:ascii="Arial" w:hAnsi="Arial" w:cs="Arial"/>
-                                <w:b/>
-                                <w:bCs/>
-                                <w:sz w:val="14"/>
-                                <w:szCs w:val="14"/>
-                                <w:u w:val="none"/>
-                                <w:lang w:val="en-US"/>
-                              </w:rPr>
-                              <w:t>FSIC_APP_NO</w:t>
-                            </w:r>
-                            <w:r>
-                              <w:rPr>
-                                <w:rFonts w:hint="default" w:ascii="Arial" w:hAnsi="Arial" w:cs="Arial"/>
-                                <w:b/>
-                                <w:bCs/>
-                                <w:sz w:val="14"/>
-                                <w:szCs w:val="14"/>
-                                <w:u w:val="none"/>
-                                <w:lang w:val="en-PH"/>
-                              </w:rPr>
-                              <w:t>}</w:t>
-                            </w:r>
-                          </w:p>
-                          <w:p>
-                            <w:pPr>
-                              <w:rPr>
-                                <w:rFonts w:hint="default"/>
-                                <w:lang w:val="en-PH"/>
-                              </w:rPr>
-                            </w:pPr>
-                          </w:p>
-                        </w:txbxContent>
-                      </wps:txbx>
-                      <wps:bodyPr rot="0" vert="horz" wrap="square" lIns="91440" tIns="45720" rIns="91440" bIns="45720" anchor="t" anchorCtr="0">
-                        <a:noAutofit/>
-                      </wps:bodyPr>
-                    </wps:wsp>
-                  </a:graphicData>
-                </a:graphic>
-              </wp:anchor>
-            </w:drawing>
-          </mc:Choice>
-          <mc:Fallback>
-            <w:pict>
-              <v:shape id="Text Box 2" o:spid="_x0000_s1026" o:spt="202" type="#_x0000_t202" style="position:absolute;left:0pt;margin-left:350.45pt;margin-top:68.6pt;height:20.65pt;width:173.45pt;mso-position-horizontal-relative:margin;z-index:-251650048;mso-width-relative:page;mso-height-relative:page;" filled="f" stroked="f" coordsize="21600,21600" o:gfxdata="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">
-                <v:fill on="f" focussize="0,0"/>
-                <v:stroke on="f" miterlimit="8" joinstyle="miter"/>
-                <v:imagedata o:title=""/>
-                <o:lock v:ext="edit" aspectratio="f"/>
-                <v:textbox>
-                  <w:txbxContent>
-                    <w:p>
-                      <w:pPr>
-                        <w:jc w:val="center"/>
-                        <w:rPr>
-                          <w:rFonts w:hint="default" w:ascii="Arial" w:hAnsi="Arial" w:cs="Arial"/>
-                          <w:b/>
-                          <w:bCs/>
-                          <w:sz w:val="14"/>
-                          <w:szCs w:val="14"/>
-                          <w:u w:val="none"/>
-                          <w:lang w:val="en-PH"/>
-                        </w:rPr>
-                      </w:pPr>
-                      <w:r>
-                        <w:rPr>
-                          <w:rFonts w:hint="default" w:ascii="Arial" w:hAnsi="Arial" w:cs="Arial"/>
-                          <w:b/>
-                          <w:bCs/>
-                          <w:sz w:val="14"/>
-                          <w:szCs w:val="14"/>
-                          <w:u w:val="none"/>
-                          <w:lang w:val="en-PH"/>
-                        </w:rPr>
-                        <w:t>{</w:t>
-                      </w:r>
-                      <w:r>
-                        <w:rPr>
-                          <w:rFonts w:hint="default" w:ascii="Arial" w:hAnsi="Arial" w:cs="Arial"/>
-                          <w:b/>
-                          <w:bCs/>
-                          <w:sz w:val="14"/>
-                          <w:szCs w:val="14"/>
-                          <w:u w:val="none"/>
-                          <w:lang w:val="en-US"/>
-                        </w:rPr>
-                        <w:t>FSIC_APP_NO</w:t>
-                      </w:r>
-                      <w:r>
-                        <w:rPr>
-                          <w:rFonts w:hint="default" w:ascii="Arial" w:hAnsi="Arial" w:cs="Arial"/>
-                          <w:b/>
-                          <w:bCs/>
-                          <w:sz w:val="14"/>
-                          <w:szCs w:val="14"/>
-                          <w:u w:val="none"/>
-                          <w:lang w:val="en-PH"/>
-                        </w:rPr>
-                        <w:t>}</w:t>
-                      </w:r>
-                    </w:p>
-                    <w:p>
-                      <w:pPr>
-                        <w:rPr>
-                          <w:rFonts w:hint="default"/>
-                          <w:lang w:val="en-PH"/>
-                        </w:rPr>
-                      </w:pPr>
-                    </w:p>
-                  </w:txbxContent>
-                </v:textbox>
-              </v:shape>
-            </w:pict>
-          </mc:Fallback>
-        </mc:AlternateContent>
-      </w:r>
       <w:r>
         <w:rPr>
           <w:rFonts w:ascii="Arial" w:hAnsi="Arial" w:cs="Arial"/>
@@ -3354,7 +3354,7 @@
         </mc:Choice>
         <mc:Fallback>
           <w:pict>
-            <v:group id="Group 20" o:spid="_x0000_s1026" o:spt="203" style="position:absolute;left:0pt;margin-left:132pt;margin-top:2.95pt;height:74.3pt;width:231.7pt;z-index:251660288;mso-width-relative:page;mso-height-relative:page;" coordorigin="3392,-404" coordsize="5062,1806" o:gfxdata="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">
+            <v:group id="Group 20" o:spid="_x0000_s1026" o:spt="203" style="position:absolute;left:0pt;margin-left:132pt;margin-top:2.95pt;height:74.3pt;width:231.7pt;z-index:251660288;mso-width-relative:page;mso-height-relative:page;" coordorigin="3392,-404" coordsize="5062,1806" o:gfxdata="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">
               <o:lock v:ext="edit" aspectratio="f"/>
               <v:shape id="Picture 20" o:spid="_x0000_s1026" o:spt="75" alt="dilg new logo.png" type="#_x0000_t75" style="position:absolute;left:3392;top:-404;height:1750;width:1573;" filled="f" o:preferrelative="f" stroked="f" coordsize="21600,21600" o:gfxdata="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">
                 <v:fill on="f" focussize="0,0"/>

</xml_diff>